<commit_message>
Restore full Additional section; remove NUS exchange and work eligibility
Co-Authored-By: Claude Sonnet 5.5 <noreply@anthropic.com>
Claude-Session: https://claude.ai/code/session_014JAFaG7KPZW1VubnBkeedU
</commit_message>
<xml_diff>
--- a/Sukwoo_Chung_Resume_McCombs.docx
+++ b/Sukwoo_Chung_Resume_McCombs.docx
@@ -134,34 +134,6 @@
     </w:p>
     <w:p>
       <w:pPr>
-        <w:pStyle w:val="ListParagraph"/>
-        <w:numPr>
-          <w:ilvl w:val="0"/>
-          <w:numId w:val="2"/>
-        </w:numPr>
-        <w:spacing w:after="0"/>
-      </w:pPr>
-      <w:r>
-        <w:rPr>
-          <w:rFonts w:ascii="Calibri" w:cs="Calibri" w:eastAsia="Calibri" w:hAnsi="Calibri"/>
-          <w:b/>
-          <w:bCs/>
-          <w:sz w:val="20"/>
-          <w:szCs w:val="20"/>
-        </w:rPr>
-        <w:t xml:space="preserve">Semester Exchange:</w:t>
-      </w:r>
-      <w:r>
-        <w:rPr>
-          <w:rFonts w:ascii="Calibri" w:cs="Calibri" w:eastAsia="Calibri" w:hAnsi="Calibri"/>
-          <w:sz w:val="20"/>
-          <w:szCs w:val="20"/>
-        </w:rPr>
-        <w:t xml:space="preserve"> National University of Singapore (NUS) Business School, Singapore | Aug – Dec 2012</w:t>
-      </w:r>
-    </w:p>
-    <w:p>
-      <w:pPr>
         <w:pBdr>
           <w:bottom w:val="single" w:color="000000" w:sz="6" w:space="1"/>
         </w:pBdr>
@@ -979,17 +951,73 @@
           <w:sz w:val="20"/>
           <w:szCs w:val="20"/>
         </w:rPr>
-        <w:t xml:space="preserve"> Founder, AiMollaeBook – book-shaped product that hides phones; sold </w:t>
-      </w:r>
-      <w:r>
-        <w:rPr>
-          <w:rFonts w:ascii="Calibri" w:cs="Calibri" w:eastAsia="Calibri" w:hAnsi="Calibri"/>
-          <w:b/>
-          <w:bCs/>
-          <w:sz w:val="20"/>
-          <w:szCs w:val="20"/>
-        </w:rPr>
-        <w:t xml:space="preserve">2,000+ units ($25K revenue)</w:t>
+        <w:t xml:space="preserve"> Founder/Product Owner, AiMollaeBook – created, as a parent, a book-shaped product that keeps a mobile phone out of sight; managed production through delivery, selling </w:t>
+      </w:r>
+      <w:r>
+        <w:rPr>
+          <w:rFonts w:ascii="Calibri" w:cs="Calibri" w:eastAsia="Calibri" w:hAnsi="Calibri"/>
+          <w:b/>
+          <w:bCs/>
+          <w:sz w:val="20"/>
+          <w:szCs w:val="20"/>
+        </w:rPr>
+        <w:t xml:space="preserve">2,000+ units and generating $25K in revenue</w:t>
+      </w:r>
+    </w:p>
+    <w:p>
+      <w:pPr>
+        <w:pStyle w:val="ListParagraph"/>
+        <w:numPr>
+          <w:ilvl w:val="0"/>
+          <w:numId w:val="2"/>
+        </w:numPr>
+        <w:spacing w:after="0"/>
+      </w:pPr>
+      <w:r>
+        <w:rPr>
+          <w:rFonts w:ascii="Calibri" w:cs="Calibri" w:eastAsia="Calibri" w:hAnsi="Calibri"/>
+          <w:b/>
+          <w:bCs/>
+          <w:sz w:val="20"/>
+          <w:szCs w:val="20"/>
+        </w:rPr>
+        <w:t xml:space="preserve">Independent Project:</w:t>
+      </w:r>
+      <w:r>
+        <w:rPr>
+          <w:rFonts w:ascii="Calibri" w:cs="Calibri" w:eastAsia="Calibri" w:hAnsi="Calibri"/>
+          <w:sz w:val="20"/>
+          <w:szCs w:val="20"/>
+        </w:rPr>
+        <w:t xml:space="preserve"> Developing a CPIM study web app with 1,500 practice questions and study notes, designing the UI in Figma and using Claude Code while inspecting and testing generated code</w:t>
+      </w:r>
+    </w:p>
+    <w:p>
+      <w:pPr>
+        <w:pStyle w:val="ListParagraph"/>
+        <w:numPr>
+          <w:ilvl w:val="0"/>
+          <w:numId w:val="2"/>
+        </w:numPr>
+        <w:spacing w:after="0"/>
+      </w:pPr>
+      <w:r>
+        <w:rPr>
+          <w:rFonts w:ascii="Calibri" w:cs="Calibri" w:eastAsia="Calibri" w:hAnsi="Calibri"/>
+          <w:b/>
+          <w:bCs/>
+          <w:sz w:val="20"/>
+          <w:szCs w:val="20"/>
+        </w:rPr>
+        <w:t xml:space="preserve">Task Forces:</w:t>
+      </w:r>
+      <w:r>
+        <w:rPr>
+          <w:rFonts w:ascii="Calibri" w:cs="Calibri" w:eastAsia="Calibri" w:hAnsi="Calibri"/>
+          <w:sz w:val="20"/>
+          <w:szCs w:val="20"/>
+        </w:rPr>
+        <w:t xml:space="preserve"> UAM Business (2021–24), Passenger Transport Productivity (2019–20)</w:t>
       </w:r>
     </w:p>
     <w:p>
@@ -1017,7 +1045,7 @@
           <w:sz w:val="20"/>
           <w:szCs w:val="20"/>
         </w:rPr>
-        <w:t xml:space="preserve"> PMP (PMI, 2026); CPIM (ASCM, 2025)</w:t>
+        <w:t xml:space="preserve"> PMP – Project Management Professional (PMI, 2026); CPIM – Certified in Planning and Inventory Management (ASCM, 2025); Linear Algebra (Imperial College London, Coursera)</w:t>
       </w:r>
     </w:p>
     <w:p>
@@ -1045,7 +1073,7 @@
           <w:sz w:val="20"/>
           <w:szCs w:val="20"/>
         </w:rPr>
-        <w:t xml:space="preserve"> SQL, Python, Power BI, Tableau, Oracle BI, Google Analytics 4, Figma, PROS RMS, IATA DDS, Claude Code</w:t>
+        <w:t xml:space="preserve"> SQL, Python; Power BI, Tableau, Oracle BI, Google Analytics 4, Google Tag Manager, Figma; PROS O&amp;D RMS/RTDP, IATA's Direct Data Solutions (DDS), CIRIUM; Claude Code for AI-assisted development</w:t>
       </w:r>
     </w:p>
     <w:p>
@@ -1074,34 +1102,6 @@
           <w:szCs w:val="20"/>
         </w:rPr>
         <w:t xml:space="preserve"> Korean (Native), Japanese (Advanced), Chinese (Basic)</w:t>
-      </w:r>
-    </w:p>
-    <w:p>
-      <w:pPr>
-        <w:pStyle w:val="ListParagraph"/>
-        <w:numPr>
-          <w:ilvl w:val="0"/>
-          <w:numId w:val="2"/>
-        </w:numPr>
-        <w:spacing w:after="0"/>
-      </w:pPr>
-      <w:r>
-        <w:rPr>
-          <w:rFonts w:ascii="Calibri" w:cs="Calibri" w:eastAsia="Calibri" w:hAnsi="Calibri"/>
-          <w:b/>
-          <w:bCs/>
-          <w:sz w:val="20"/>
-          <w:szCs w:val="20"/>
-        </w:rPr>
-        <w:t xml:space="preserve">Work Eligibility:</w:t>
-      </w:r>
-      <w:r>
-        <w:rPr>
-          <w:rFonts w:ascii="Calibri" w:cs="Calibri" w:eastAsia="Calibri" w:hAnsi="Calibri"/>
-          <w:sz w:val="20"/>
-          <w:szCs w:val="20"/>
-        </w:rPr>
-        <w:t xml:space="preserve"> Eligible to work in the U.S.; will require visa sponsorship for full-time employment</w:t>
       </w:r>
     </w:p>
     <w:sectPr>

</xml_diff>